<commit_message>
Update CV with JD Transport and Sepur experience
Co-Authored-By: Claude Sonnet 5.5 <noreply@anthropic.com>
Claude-Session: https://claude.ai/code/session_01DUbn4Th4apYFBri86PVviG
</commit_message>
<xml_diff>
--- a/CV_Rony_Atrid.docx
+++ b/CV_Rony_Atrid.docx
@@ -85,7 +85,7 @@
           <w:b w:val="0"/>
           <w:i w:val="0"/>
         </w:rPr>
-        <w:t>Chauffeur poids lourd et ripeur avec plus de 3 ans d'expérience en collecte de déchets (Reims, Sézanne et alentours), complétés par une solide expérience du bâtiment. Sérieux, autonome, ponctuel, habitué au travail en équipe et au respect strict des règles de sécurité.</w:t>
+        <w:t>Chauffeur poids lourd et ripeur avec plus de 10 ans d'expérience : collecte de déchets, transport frigorifique, collecte en élevage et nettoyage, complétés par une solide expérience du bâtiment. Sérieux, autonome, ponctuel, habitué au travail en équipe et au respect strict des règles de sécurité.</w:t>
       </w:r>
     </w:p>
     <w:p>
@@ -171,6 +171,14 @@
     </w:p>
     <w:p>
       <w:pPr>
+        <w:pStyle w:val="ListBullet"/>
+      </w:pPr>
+      <w:r>
+        <w:t>Transport frigorifique, livraisons en Île-de-France, collecte en élevage avicole</w:t>
+      </w:r>
+    </w:p>
+    <w:p>
+      <w:pPr>
         <w:spacing w:after="40" w:before="120"/>
         <w:pBdr>
           <w:bottom w:val="single" w:sz="8" w:space="1" w:color="1F3F7A"/>
@@ -184,6 +192,39 @@
           <w:sz w:val="24"/>
         </w:rPr>
         <w:t>EXPÉRIENCE PROFESSIONNELLE</w:t>
+      </w:r>
+    </w:p>
+    <w:p>
+      <w:pPr>
+        <w:tabs>
+          <w:tab w:pos="2041" w:val="left"/>
+        </w:tabs>
+        <w:spacing w:before="60"/>
+      </w:pPr>
+      <w:r>
+        <w:rPr>
+          <w:b/>
+          <w:color w:val="1F3F7A"/>
+        </w:rPr>
+        <w:t>Oct. 2023 - Août 2026</w:t>
+        <w:tab/>
+      </w:r>
+      <w:r>
+        <w:rPr>
+          <w:b/>
+        </w:rPr>
+        <w:t>Conducteur collecte / élevage / nettoyage</w:t>
+      </w:r>
+    </w:p>
+    <w:p>
+      <w:pPr>
+        <w:ind w:left="2041"/>
+      </w:pPr>
+      <w:r>
+        <w:rPr>
+          <w:i/>
+        </w:rPr>
+        <w:t>Sepur, Dormans (ancienneté reprise au 01/07/2019)</w:t>
       </w:r>
     </w:p>
     <w:p>
@@ -231,6 +272,48 @@
           <w:b/>
           <w:color w:val="1F3F7A"/>
         </w:rPr>
+        <w:t>Mai 2018 - Sept. 2019</w:t>
+        <w:tab/>
+      </w:r>
+      <w:r>
+        <w:rPr>
+          <w:b/>
+        </w:rPr>
+        <w:t>Chauffeur-livreur PL (CDD)</w:t>
+      </w:r>
+    </w:p>
+    <w:p>
+      <w:pPr>
+        <w:ind w:left="2041"/>
+      </w:pPr>
+      <w:r>
+        <w:rPr>
+          <w:i/>
+        </w:rPr>
+        <w:t>JD Transport, Esternay</w:t>
+      </w:r>
+    </w:p>
+    <w:p>
+      <w:pPr>
+        <w:pStyle w:val="ListBullet"/>
+        <w:ind w:left="2324"/>
+      </w:pPr>
+      <w:r>
+        <w:t>Livraisons PL sur Paris et région parisienne, transport frigorifique, collecte en élevage avicole</w:t>
+      </w:r>
+    </w:p>
+    <w:p>
+      <w:pPr>
+        <w:tabs>
+          <w:tab w:pos="2041" w:val="left"/>
+        </w:tabs>
+        <w:spacing w:before="60"/>
+      </w:pPr>
+      <w:r>
+        <w:rPr>
+          <w:b/>
+          <w:color w:val="1F3F7A"/>
+        </w:rPr>
         <w:t>Oct. 2013 - Fév. 2015</w:t>
         <w:tab/>
       </w:r>
@@ -258,16 +341,7 @@
         <w:ind w:left="2324"/>
       </w:pPr>
       <w:r>
-        <w:t>Missions régulières de ripeur et de chauffeur en collecte de déchets</w:t>
-      </w:r>
-    </w:p>
-    <w:p>
-      <w:pPr>
-        <w:pStyle w:val="ListBullet"/>
-        <w:ind w:left="2324"/>
-      </w:pPr>
-      <w:r>
-        <w:t>Opérateur de manutention (avril 2014)</w:t>
+        <w:t>Missions régulières de ripeur et de chauffeur en collecte de déchets ; manœuvre (2012), opérateur de manutention (2014)</w:t>
       </w:r>
     </w:p>
     <w:p>
@@ -315,39 +389,6 @@
           <w:b/>
           <w:color w:val="1F3F7A"/>
         </w:rPr>
-        <w:t>Janv. - Avr. 2012</w:t>
-        <w:tab/>
-      </w:r>
-      <w:r>
-        <w:rPr>
-          <w:b/>
-        </w:rPr>
-        <w:t>Manœuvre - missions intérim</w:t>
-      </w:r>
-    </w:p>
-    <w:p>
-      <w:pPr>
-        <w:ind w:left="2041"/>
-      </w:pPr>
-      <w:r>
-        <w:rPr>
-          <w:i/>
-        </w:rPr>
-        <w:t>Sup Intérim, Sézanne</w:t>
-      </w:r>
-    </w:p>
-    <w:p>
-      <w:pPr>
-        <w:tabs>
-          <w:tab w:pos="2041" w:val="left"/>
-        </w:tabs>
-        <w:spacing w:before="60"/>
-      </w:pPr>
-      <w:r>
-        <w:rPr>
-          <w:b/>
-          <w:color w:val="1F3F7A"/>
-        </w:rPr>
         <w:t>2007 - 2010</w:t>
         <w:tab/>
       </w:r>
@@ -371,15 +412,6 @@
     </w:p>
     <w:p>
       <w:pPr>
-        <w:pStyle w:val="ListBullet"/>
-        <w:ind w:left="2324"/>
-      </w:pPr>
-      <w:r>
-        <w:t>Contrat terminé en décembre 2010 : licenciement économique (liquidation de l'entreprise)</w:t>
-      </w:r>
-    </w:p>
-    <w:p>
-      <w:pPr>
         <w:tabs>
           <w:tab w:pos="2041" w:val="left"/>
         </w:tabs>
@@ -390,14 +422,14 @@
           <w:b/>
           <w:color w:val="1F3F7A"/>
         </w:rPr>
-        <w:t>2006</w:t>
+        <w:t>1999 - 2006</w:t>
         <w:tab/>
       </w:r>
       <w:r>
         <w:rPr>
           <w:b/>
         </w:rPr>
-        <w:t>Ouvrier polyvalent du bâtiment</w:t>
+        <w:t>Ouvrier du bâtiment / ouvrier polyvalent</w:t>
       </w:r>
     </w:p>
     <w:p>
@@ -408,73 +440,7 @@
         <w:rPr>
           <w:i/>
         </w:rPr>
-        <w:t>Batilux, Aulnay-sous-Bois</w:t>
-      </w:r>
-    </w:p>
-    <w:p>
-      <w:pPr>
-        <w:tabs>
-          <w:tab w:pos="2041" w:val="left"/>
-        </w:tabs>
-        <w:spacing w:before="60"/>
-      </w:pPr>
-      <w:r>
-        <w:rPr>
-          <w:b/>
-          <w:color w:val="1F3F7A"/>
-        </w:rPr>
-        <w:t>2005</w:t>
-        <w:tab/>
-      </w:r>
-      <w:r>
-        <w:rPr>
-          <w:b/>
-        </w:rPr>
-        <w:t>Manœuvre maçon polyvalent</w:t>
-      </w:r>
-    </w:p>
-    <w:p>
-      <w:pPr>
-        <w:ind w:left="2041"/>
-      </w:pPr>
-      <w:r>
-        <w:rPr>
-          <w:i/>
-        </w:rPr>
-        <w:t>GTP, Baie-Mahault (Guadeloupe)</w:t>
-      </w:r>
-    </w:p>
-    <w:p>
-      <w:pPr>
-        <w:tabs>
-          <w:tab w:pos="2041" w:val="left"/>
-        </w:tabs>
-        <w:spacing w:before="60"/>
-      </w:pPr>
-      <w:r>
-        <w:rPr>
-          <w:b/>
-          <w:color w:val="1F3F7A"/>
-        </w:rPr>
-        <w:t>1999 - 2005</w:t>
-        <w:tab/>
-      </w:r>
-      <w:r>
-        <w:rPr>
-          <w:b/>
-        </w:rPr>
-        <w:t>Ouvrier du bâtiment (construction de maisons individuelles)</w:t>
-      </w:r>
-    </w:p>
-    <w:p>
-      <w:pPr>
-        <w:ind w:left="2041"/>
-      </w:pPr>
-      <w:r>
-        <w:rPr>
-          <w:i/>
-        </w:rPr>
-        <w:t>Diverses entreprises (Guadeloupe)</w:t>
+        <w:t>Batilux (Aulnay-sous-Bois), GTP (Guadeloupe) et diverses entreprises</w:t>
       </w:r>
     </w:p>
     <w:p>

</xml_diff>

<commit_message>
CV: add ECT Collecte (acquired by Sepur)
Co-Authored-By: Claude Sonnet 5.5 <noreply@anthropic.com>
Claude-Session: https://claude.ai/code/session_01DUbn4Th4apYFBri86PVviG
</commit_message>
<xml_diff>
--- a/CV_Rony_Atrid.docx
+++ b/CV_Rony_Atrid.docx
@@ -206,7 +206,7 @@
           <w:b/>
           <w:color w:val="1F3F7A"/>
         </w:rPr>
-        <w:t>Oct. 2023 - Août 2026</w:t>
+        <w:t>Juil. 2019 - Août 2026</w:t>
         <w:tab/>
       </w:r>
       <w:r>
@@ -224,7 +224,7 @@
         <w:rPr>
           <w:i/>
         </w:rPr>
-        <w:t>Sepur, Dormans (ancienneté reprise au 01/07/2019)</w:t>
+        <w:t>ECT Collecte, puis Sepur après rachat (Dormans)</w:t>
       </w:r>
     </w:p>
     <w:p>

</xml_diff>

<commit_message>
CV: show years only
Co-Authored-By: Claude Sonnet 5.5 <noreply@anthropic.com>
Claude-Session: https://claude.ai/code/session_01DUbn4Th4apYFBri86PVviG
</commit_message>
<xml_diff>
--- a/CV_Rony_Atrid.docx
+++ b/CV_Rony_Atrid.docx
@@ -206,7 +206,7 @@
           <w:b/>
           <w:color w:val="1F3F7A"/>
         </w:rPr>
-        <w:t>Juil. 2019 - Août 2026</w:t>
+        <w:t>2019 - 2026</w:t>
         <w:tab/>
       </w:r>
       <w:r>
@@ -239,7 +239,7 @@
           <w:b/>
           <w:color w:val="1F3F7A"/>
         </w:rPr>
-        <w:t>Août 2026</w:t>
+        <w:t>2026</w:t>
         <w:tab/>
       </w:r>
       <w:r>
@@ -272,7 +272,7 @@
           <w:b/>
           <w:color w:val="1F3F7A"/>
         </w:rPr>
-        <w:t>Mai 2018 - Sept. 2019</w:t>
+        <w:t>2018 - 2019</w:t>
         <w:tab/>
       </w:r>
       <w:r>
@@ -314,7 +314,7 @@
           <w:b/>
           <w:color w:val="1F3F7A"/>
         </w:rPr>
-        <w:t>Oct. 2013 - Fév. 2015</w:t>
+        <w:t>2013 - 2015</w:t>
         <w:tab/>
       </w:r>
       <w:r>
@@ -356,7 +356,7 @@
           <w:b/>
           <w:color w:val="1F3F7A"/>
         </w:rPr>
-        <w:t>Mai 2012 - Avr. 2013</w:t>
+        <w:t>2012 - 2013</w:t>
         <w:tab/>
       </w:r>
       <w:r>

</xml_diff>